<commit_message>
actualización de la documentación
</commit_message>
<xml_diff>
--- a/Fase_1/Evidencias_Grupales/1.5_GuiaEstudiante_Fase 1_Definicion Proyecto APT (1).docx
+++ b/Fase_1/Evidencias_Grupales/1.5_GuiaEstudiante_Fase 1_Definicion Proyecto APT (1).docx
@@ -943,25 +943,7 @@
                 <w:sz w:val="20"/>
                 <w:szCs w:val="20"/>
               </w:rPr>
-              <w:t xml:space="preserve">Desarrollo </w:t>
-            </w:r>
-            <w:r>
-              <w:rPr>
-                <w:rFonts w:asciiTheme="minorHAnsi" w:hAnsiTheme="minorHAnsi" w:cstheme="minorHAnsi"/>
-                <w:color w:val="000000" w:themeColor="text1"/>
-                <w:sz w:val="20"/>
-                <w:szCs w:val="20"/>
-              </w:rPr>
-              <w:t>de Software</w:t>
-            </w:r>
-            <w:r>
-              <w:rPr>
-                <w:rFonts w:asciiTheme="minorHAnsi" w:hAnsiTheme="minorHAnsi" w:cstheme="minorHAnsi"/>
-                <w:color w:val="000000" w:themeColor="text1"/>
-                <w:sz w:val="20"/>
-                <w:szCs w:val="20"/>
-              </w:rPr>
-              <w:t>.</w:t>
+              <w:t>Desarrollo de Software.</w:t>
             </w:r>
           </w:p>
           <w:p>
@@ -985,25 +967,7 @@
                 <w:sz w:val="20"/>
                 <w:szCs w:val="20"/>
               </w:rPr>
-              <w:t>Inteligencia Artificial / Ciencia de Datos</w:t>
-            </w:r>
-            <w:r>
-              <w:rPr>
-                <w:rFonts w:asciiTheme="minorHAnsi" w:hAnsiTheme="minorHAnsi" w:cstheme="minorHAnsi"/>
-                <w:color w:val="000000" w:themeColor="text1"/>
-                <w:sz w:val="20"/>
-                <w:szCs w:val="20"/>
-              </w:rPr>
-              <w:t>.</w:t>
-            </w:r>
-            <w:r>
-              <w:rPr>
-                <w:rFonts w:asciiTheme="minorHAnsi" w:hAnsiTheme="minorHAnsi" w:cstheme="minorHAnsi"/>
-                <w:color w:val="000000" w:themeColor="text1"/>
-                <w:sz w:val="20"/>
-                <w:szCs w:val="20"/>
-              </w:rPr>
-              <w:t xml:space="preserve"> </w:t>
+              <w:t xml:space="preserve">Inteligencia Artificial / Ciencia de Datos. </w:t>
             </w:r>
           </w:p>
           <w:p>
@@ -1027,16 +991,7 @@
                 <w:sz w:val="20"/>
                 <w:szCs w:val="20"/>
               </w:rPr>
-              <w:t>Arquitectura de Sistemas Nube</w:t>
-            </w:r>
-            <w:r>
-              <w:rPr>
-                <w:rFonts w:asciiTheme="minorHAnsi" w:hAnsiTheme="minorHAnsi" w:cstheme="minorHAnsi"/>
-                <w:color w:val="000000" w:themeColor="text1"/>
-                <w:sz w:val="20"/>
-                <w:szCs w:val="20"/>
-              </w:rPr>
-              <w:t>.</w:t>
+              <w:t>Arquitectura de Sistemas Nube.</w:t>
             </w:r>
           </w:p>
           <w:p>
@@ -1801,103 +1756,7 @@
                 <w:sz w:val="20"/>
                 <w:szCs w:val="20"/>
               </w:rPr>
-              <w:t xml:space="preserve">La razón por la que aliguemos esta idea para nuestro proyecto de </w:t>
-            </w:r>
-            <w:r>
-              <w:rPr>
-                <w:color w:val="000000" w:themeColor="text1"/>
-                <w:sz w:val="20"/>
-                <w:szCs w:val="20"/>
-              </w:rPr>
-              <w:t>título</w:t>
-            </w:r>
-            <w:r>
-              <w:rPr>
-                <w:color w:val="000000" w:themeColor="text1"/>
-                <w:sz w:val="20"/>
-                <w:szCs w:val="20"/>
-              </w:rPr>
-              <w:t xml:space="preserve"> es para volver mucho </w:t>
-            </w:r>
-            <w:r>
-              <w:rPr>
-                <w:color w:val="000000" w:themeColor="text1"/>
-                <w:sz w:val="20"/>
-                <w:szCs w:val="20"/>
-              </w:rPr>
-              <w:t>más</w:t>
-            </w:r>
-            <w:r>
-              <w:rPr>
-                <w:color w:val="000000" w:themeColor="text1"/>
-                <w:sz w:val="20"/>
-                <w:szCs w:val="20"/>
-              </w:rPr>
-              <w:t xml:space="preserve"> fácil para las personas el </w:t>
-            </w:r>
-            <w:r>
-              <w:rPr>
-                <w:color w:val="000000" w:themeColor="text1"/>
-                <w:sz w:val="20"/>
-                <w:szCs w:val="20"/>
-              </w:rPr>
-              <w:t>hecho</w:t>
-            </w:r>
-            <w:r>
-              <w:rPr>
-                <w:color w:val="000000" w:themeColor="text1"/>
-                <w:sz w:val="20"/>
-                <w:szCs w:val="20"/>
-              </w:rPr>
-              <w:t xml:space="preserve"> de reciclar, saber en </w:t>
-            </w:r>
-            <w:r>
-              <w:rPr>
-                <w:color w:val="000000" w:themeColor="text1"/>
-                <w:sz w:val="20"/>
-                <w:szCs w:val="20"/>
-              </w:rPr>
-              <w:t>dónde</w:t>
-            </w:r>
-            <w:r>
-              <w:rPr>
-                <w:color w:val="000000" w:themeColor="text1"/>
-                <w:sz w:val="20"/>
-                <w:szCs w:val="20"/>
-              </w:rPr>
-              <w:t xml:space="preserve"> </w:t>
-            </w:r>
-            <w:r>
-              <w:rPr>
-                <w:color w:val="000000" w:themeColor="text1"/>
-                <w:sz w:val="20"/>
-                <w:szCs w:val="20"/>
-              </w:rPr>
-              <w:t>está</w:t>
-            </w:r>
-            <w:r>
-              <w:rPr>
-                <w:color w:val="000000" w:themeColor="text1"/>
-                <w:sz w:val="20"/>
-                <w:szCs w:val="20"/>
-              </w:rPr>
-              <w:t xml:space="preserve"> el punto </w:t>
-            </w:r>
-            <w:r>
-              <w:rPr>
-                <w:color w:val="000000" w:themeColor="text1"/>
-                <w:sz w:val="20"/>
-                <w:szCs w:val="20"/>
-              </w:rPr>
-              <w:t>más</w:t>
-            </w:r>
-            <w:r>
-              <w:rPr>
-                <w:color w:val="000000" w:themeColor="text1"/>
-                <w:sz w:val="20"/>
-                <w:szCs w:val="20"/>
-              </w:rPr>
-              <w:t xml:space="preserve"> cercano de reciclaje o saber que se puede reciclar en ese punto como y como bonus de reciclar obtiene punto que se podrán usar para canjear cosas de al APP. </w:t>
+              <w:t xml:space="preserve">La razón por la que aliguemos esta idea para nuestro proyecto de título es para volver mucho más fácil para las personas el hecho de reciclar, saber en dónde está el punto más cercano de reciclaje o saber que se puede reciclar en ese punto como y como bonus de reciclar obtiene punto que se podrán usar para canjear cosas de al APP. </w:t>
             </w:r>
           </w:p>
           <w:p>
@@ -1915,23 +1774,7 @@
                 <w:sz w:val="20"/>
                 <w:szCs w:val="20"/>
               </w:rPr>
-              <w:t xml:space="preserve">La relevancia que tiene este proyecto en el campo laborar es que se usaran muchas de las tecnologías </w:t>
-            </w:r>
-            <w:r>
-              <w:rPr>
-                <w:color w:val="000000" w:themeColor="text1"/>
-                <w:sz w:val="20"/>
-                <w:szCs w:val="20"/>
-              </w:rPr>
-              <w:t>más</w:t>
-            </w:r>
-            <w:r>
-              <w:rPr>
-                <w:color w:val="000000" w:themeColor="text1"/>
-                <w:sz w:val="20"/>
-                <w:szCs w:val="20"/>
-              </w:rPr>
-              <w:t xml:space="preserve"> relevantes en la actualidad para la industria como, la Inteligencia Artificial que en la actualidad ya no se limita a grandes servidores o entornos de laboratorio. El mercado tiene una alta demanda de ingenieros con altos conocimientos de Machine </w:t>
+              <w:t xml:space="preserve">La relevancia que tiene este proyecto en el campo laborar es que se usaran muchas de las tecnologías más relevantes en la actualidad para la industria como, la Inteligencia Artificial que en la actualidad ya no se limita a grandes servidores o entornos de laboratorio. El mercado tiene una alta demanda de ingenieros con altos conocimientos de Machine </w:t>
             </w:r>
             <w:proofErr w:type="spellStart"/>
             <w:r>
@@ -1985,47 +1828,7 @@
                 <w:sz w:val="20"/>
                 <w:szCs w:val="20"/>
               </w:rPr>
-              <w:t>E</w:t>
-            </w:r>
-            <w:r>
-              <w:rPr>
-                <w:color w:val="000000" w:themeColor="text1"/>
-                <w:sz w:val="20"/>
-                <w:szCs w:val="20"/>
-              </w:rPr>
-              <w:t xml:space="preserve">l are objetivó </w:t>
-            </w:r>
-            <w:r>
-              <w:rPr>
-                <w:color w:val="000000" w:themeColor="text1"/>
-                <w:sz w:val="20"/>
-                <w:szCs w:val="20"/>
-              </w:rPr>
-              <w:t>del proyecto</w:t>
-            </w:r>
-            <w:r>
-              <w:rPr>
-                <w:color w:val="000000" w:themeColor="text1"/>
-                <w:sz w:val="20"/>
-                <w:szCs w:val="20"/>
-              </w:rPr>
-              <w:t xml:space="preserve"> en sus inicios es la región metropolitana del país de chile. Santiago es una metrópoli con una población aproximada de 6,7 millones de personas que genera una gran cantidad de residuos que tienen la infraestructura para el </w:t>
-            </w:r>
-            <w:r>
-              <w:rPr>
-                <w:color w:val="000000" w:themeColor="text1"/>
-                <w:sz w:val="20"/>
-                <w:szCs w:val="20"/>
-              </w:rPr>
-              <w:t>reciclaje,</w:t>
-            </w:r>
-            <w:r>
-              <w:rPr>
-                <w:color w:val="000000" w:themeColor="text1"/>
-                <w:sz w:val="20"/>
-                <w:szCs w:val="20"/>
-              </w:rPr>
-              <w:t xml:space="preserve"> pero no tiene una cultura de reciclaje.</w:t>
+              <w:t>El are objetivó del proyecto en sus inicios es la región metropolitana del país de chile. Santiago es una metrópoli con una población aproximada de 6,7 millones de personas que genera una gran cantidad de residuos que tienen la infraestructura para el reciclaje, pero no tiene una cultura de reciclaje.</w:t>
             </w:r>
           </w:p>
           <w:p>
@@ -2137,47 +1940,7 @@
                 <w:sz w:val="20"/>
                 <w:szCs w:val="20"/>
               </w:rPr>
-              <w:t>E</w:t>
-            </w:r>
-            <w:r>
-              <w:rPr>
-                <w:color w:val="000000" w:themeColor="text1"/>
-                <w:sz w:val="20"/>
-                <w:szCs w:val="20"/>
-              </w:rPr>
-              <w:t xml:space="preserve">l valor que tendría este proyecto </w:t>
-            </w:r>
-            <w:r>
-              <w:rPr>
-                <w:color w:val="000000" w:themeColor="text1"/>
-                <w:sz w:val="20"/>
-                <w:szCs w:val="20"/>
-              </w:rPr>
-              <w:t>sería</w:t>
-            </w:r>
-            <w:r>
-              <w:rPr>
-                <w:color w:val="000000" w:themeColor="text1"/>
-                <w:sz w:val="20"/>
-                <w:szCs w:val="20"/>
-              </w:rPr>
-              <w:t xml:space="preserve"> el fomentar e informar a </w:t>
-            </w:r>
-            <w:r>
-              <w:rPr>
-                <w:color w:val="000000" w:themeColor="text1"/>
-                <w:sz w:val="20"/>
-                <w:szCs w:val="20"/>
-              </w:rPr>
-              <w:t>más</w:t>
-            </w:r>
-            <w:r>
-              <w:rPr>
-                <w:color w:val="000000" w:themeColor="text1"/>
-                <w:sz w:val="20"/>
-                <w:szCs w:val="20"/>
-              </w:rPr>
-              <w:t xml:space="preserve"> personas de como reciclar bien y en donde puede llevar sus residuos y si son reciclables en si</w:t>
+              <w:t>El valor que tendría este proyecto sería el fomentar e informar a más personas de como reciclar bien y en donde puede llevar sus residuos y si son reciclables en si</w:t>
             </w:r>
           </w:p>
         </w:tc>
@@ -2243,23 +2006,7 @@
                 <w:sz w:val="20"/>
                 <w:szCs w:val="20"/>
               </w:rPr>
-              <w:t xml:space="preserve">El proyecto </w:t>
-            </w:r>
-            <w:r>
-              <w:rPr>
-                <w:color w:val="000000" w:themeColor="text1"/>
-                <w:sz w:val="20"/>
-                <w:szCs w:val="20"/>
-              </w:rPr>
-              <w:t>tiene como</w:t>
-            </w:r>
-            <w:r>
-              <w:rPr>
-                <w:color w:val="000000" w:themeColor="text1"/>
-                <w:sz w:val="20"/>
-                <w:szCs w:val="20"/>
-              </w:rPr>
-              <w:t xml:space="preserve"> objetivo 3 puntos principales:</w:t>
+              <w:t>El proyecto tiene como objetivo 3 puntos principales:</w:t>
             </w:r>
           </w:p>
           <w:p>
@@ -2292,23 +2039,7 @@
                 <w:sz w:val="20"/>
                 <w:szCs w:val="20"/>
               </w:rPr>
-              <w:t xml:space="preserve">: Lo que se quiere conseguir es que el usuario sepa en donde </w:t>
-            </w:r>
-            <w:r>
-              <w:rPr>
-                <w:color w:val="000000" w:themeColor="text1"/>
-                <w:sz w:val="20"/>
-                <w:szCs w:val="20"/>
-              </w:rPr>
-              <w:t>está</w:t>
-            </w:r>
-            <w:r>
-              <w:rPr>
-                <w:color w:val="000000" w:themeColor="text1"/>
-                <w:sz w:val="20"/>
-                <w:szCs w:val="20"/>
-              </w:rPr>
-              <w:t xml:space="preserve"> el punto de reciclaje as cercano y que pueda saber que categoría de reciclaje acepta ese punto.</w:t>
+              <w:t>: Lo que se quiere conseguir es que el usuario sepa en donde está el punto de reciclaje as cercano y que pueda saber que categoría de reciclaje acepta ese punto.</w:t>
             </w:r>
           </w:p>
           <w:p>
@@ -2341,39 +2072,7 @@
                 <w:sz w:val="20"/>
                 <w:szCs w:val="20"/>
               </w:rPr>
-              <w:t xml:space="preserve">: Escanearemos un residuo con el teléfono y con una inteligencia artificial se identificará el tipo de residuo, clasificándolo en una de </w:t>
-            </w:r>
-            <w:r>
-              <w:rPr>
-                <w:color w:val="000000" w:themeColor="text1"/>
-                <w:sz w:val="20"/>
-                <w:szCs w:val="20"/>
-              </w:rPr>
-              <w:t>la categoría</w:t>
-            </w:r>
-            <w:r>
-              <w:rPr>
-                <w:color w:val="000000" w:themeColor="text1"/>
-                <w:sz w:val="20"/>
-                <w:szCs w:val="20"/>
-              </w:rPr>
-              <w:t xml:space="preserve"> de reciclaje, si el residuo no pertenece a ninguna categoría se identifica este residuo como un </w:t>
-            </w:r>
-            <w:r>
-              <w:rPr>
-                <w:color w:val="000000" w:themeColor="text1"/>
-                <w:sz w:val="20"/>
-                <w:szCs w:val="20"/>
-              </w:rPr>
-              <w:t>residuo no reciclable</w:t>
-            </w:r>
-            <w:r>
-              <w:rPr>
-                <w:color w:val="000000" w:themeColor="text1"/>
-                <w:sz w:val="20"/>
-                <w:szCs w:val="20"/>
-              </w:rPr>
-              <w:t>.</w:t>
+              <w:t>: Escanearemos un residuo con el teléfono y con una inteligencia artificial se identificará el tipo de residuo, clasificándolo en una de la categoría de reciclaje, si el residuo no pertenece a ninguna categoría se identifica este residuo como un residuo no reciclable.</w:t>
             </w:r>
           </w:p>
           <w:p>
@@ -2464,39 +2163,7 @@
                 <w:sz w:val="20"/>
                 <w:szCs w:val="20"/>
               </w:rPr>
-              <w:t xml:space="preserve">Este proyecto APT se relaciona de manera directa con el perfil de egresado de la carrera de Ingeniería en Informática, ya que exige abarcar el ciclo completo de vida del software: desde la comprensión de un problema real hasta el diseño de la arquitectura, el desarrollo de código y el control de calidad. Para lograr resolver el problema del reciclaje domiciliario y la desinformación en </w:t>
-            </w:r>
-            <w:r>
-              <w:rPr>
-                <w:color w:val="000000" w:themeColor="text1"/>
-                <w:sz w:val="20"/>
-                <w:szCs w:val="20"/>
-              </w:rPr>
-              <w:t>el punto</w:t>
-            </w:r>
-            <w:r>
-              <w:rPr>
-                <w:color w:val="000000" w:themeColor="text1"/>
-                <w:sz w:val="20"/>
-                <w:szCs w:val="20"/>
-              </w:rPr>
-              <w:t xml:space="preserve"> de residuos, las competencias que son prescindibles para el desarrollo de </w:t>
-            </w:r>
-            <w:r>
-              <w:rPr>
-                <w:color w:val="000000" w:themeColor="text1"/>
-                <w:sz w:val="20"/>
-                <w:szCs w:val="20"/>
-              </w:rPr>
-              <w:t>este proyecto</w:t>
-            </w:r>
-            <w:r>
-              <w:rPr>
-                <w:color w:val="000000" w:themeColor="text1"/>
-                <w:sz w:val="20"/>
-                <w:szCs w:val="20"/>
-              </w:rPr>
-              <w:t xml:space="preserve"> son:</w:t>
+              <w:t>Este proyecto APT se relaciona de manera directa con el perfil de egresado de la carrera de Ingeniería en Informática, ya que exige abarcar el ciclo completo de vida del software: desde la comprensión de un problema real hasta el diseño de la arquitectura, el desarrollo de código y el control de calidad. Para lograr resolver el problema del reciclaje domiciliario y la desinformación en el punto de residuos, las competencias que son prescindibles para el desarrollo de este proyecto son:</w:t>
             </w:r>
           </w:p>
           <w:p>
@@ -2529,23 +2196,7 @@
                 <w:sz w:val="20"/>
                 <w:szCs w:val="20"/>
               </w:rPr>
-              <w:t xml:space="preserve">: Para la construcción de la aplicación se </w:t>
-            </w:r>
-            <w:r>
-              <w:rPr>
-                <w:color w:val="000000" w:themeColor="text1"/>
-                <w:sz w:val="20"/>
-                <w:szCs w:val="20"/>
-              </w:rPr>
-              <w:t>usará</w:t>
-            </w:r>
-            <w:r>
-              <w:rPr>
-                <w:color w:val="000000" w:themeColor="text1"/>
-                <w:sz w:val="20"/>
-                <w:szCs w:val="20"/>
-              </w:rPr>
-              <w:t xml:space="preserve"> la tecnología </w:t>
+              <w:t xml:space="preserve">: Para la construcción de la aplicación se usará la tecnología </w:t>
             </w:r>
             <w:proofErr w:type="spellStart"/>
             <w:r>
@@ -2596,39 +2247,7 @@
                 <w:sz w:val="20"/>
                 <w:szCs w:val="20"/>
               </w:rPr>
-              <w:t xml:space="preserve">: Se </w:t>
-            </w:r>
-            <w:r>
-              <w:rPr>
-                <w:color w:val="000000" w:themeColor="text1"/>
-                <w:sz w:val="20"/>
-                <w:szCs w:val="20"/>
-              </w:rPr>
-              <w:t>automatizará</w:t>
-            </w:r>
-            <w:r>
-              <w:rPr>
-                <w:color w:val="000000" w:themeColor="text1"/>
-                <w:sz w:val="20"/>
-                <w:szCs w:val="20"/>
-              </w:rPr>
-              <w:t xml:space="preserve"> la clasificación de las imágenes en una de </w:t>
-            </w:r>
-            <w:r>
-              <w:rPr>
-                <w:color w:val="000000" w:themeColor="text1"/>
-                <w:sz w:val="20"/>
-                <w:szCs w:val="20"/>
-              </w:rPr>
-              <w:t>la categoría</w:t>
-            </w:r>
-            <w:r>
-              <w:rPr>
-                <w:color w:val="000000" w:themeColor="text1"/>
-                <w:sz w:val="20"/>
-                <w:szCs w:val="20"/>
-              </w:rPr>
-              <w:t xml:space="preserve"> de reciclajes que se establecieron, las competencias de construir modelos de datos, manejar estadística descriptiva e implementar soluciones innovadoras. Lo que nos permitirá realizar el preprocesamiento de imágenes, ejecutar técnicas de Transfer </w:t>
+              <w:t xml:space="preserve">: Se automatizará la clasificación de las imágenes en una de la categoría de reciclajes que se establecieron, las competencias de construir modelos de datos, manejar estadística descriptiva e implementar soluciones innovadoras. Lo que nos permitirá realizar el preprocesamiento de imágenes, ejecutar técnicas de Transfer </w:t>
             </w:r>
             <w:proofErr w:type="spellStart"/>
             <w:r>
@@ -2699,119 +2318,7 @@
                 <w:sz w:val="20"/>
                 <w:szCs w:val="20"/>
               </w:rPr>
-              <w:t xml:space="preserve">: Las competencias que se </w:t>
-            </w:r>
-            <w:r>
-              <w:rPr>
-                <w:color w:val="000000" w:themeColor="text1"/>
-                <w:sz w:val="20"/>
-                <w:szCs w:val="20"/>
-              </w:rPr>
-              <w:t>necesitan</w:t>
-            </w:r>
-            <w:r>
-              <w:rPr>
-                <w:color w:val="000000" w:themeColor="text1"/>
-                <w:sz w:val="20"/>
-                <w:szCs w:val="20"/>
-              </w:rPr>
-              <w:t xml:space="preserve"> para realizar pruebas de calidad es indispensable para validar la precisión del modelo en situaciones reales (iluminación, fondos variados) y verificar la seguridad del sistema de puntos mediante reglas que </w:t>
-            </w:r>
-            <w:r>
-              <w:rPr>
-                <w:color w:val="000000" w:themeColor="text1"/>
-                <w:sz w:val="20"/>
-                <w:szCs w:val="20"/>
-              </w:rPr>
-              <w:t>eviten</w:t>
-            </w:r>
-            <w:r>
-              <w:rPr>
-                <w:color w:val="000000" w:themeColor="text1"/>
-                <w:sz w:val="20"/>
-                <w:szCs w:val="20"/>
-              </w:rPr>
-              <w:t xml:space="preserve"> </w:t>
-            </w:r>
-            <w:r>
-              <w:rPr>
-                <w:color w:val="000000" w:themeColor="text1"/>
-                <w:sz w:val="20"/>
-                <w:szCs w:val="20"/>
-              </w:rPr>
-              <w:t>abuso</w:t>
-            </w:r>
-            <w:r>
-              <w:rPr>
-                <w:color w:val="000000" w:themeColor="text1"/>
-                <w:sz w:val="20"/>
-                <w:szCs w:val="20"/>
-              </w:rPr>
-              <w:t xml:space="preserve"> de los </w:t>
-            </w:r>
-            <w:r>
-              <w:rPr>
-                <w:color w:val="000000" w:themeColor="text1"/>
-                <w:sz w:val="20"/>
-                <w:szCs w:val="20"/>
-              </w:rPr>
-              <w:t>usaron</w:t>
-            </w:r>
-            <w:r>
-              <w:rPr>
-                <w:color w:val="000000" w:themeColor="text1"/>
-                <w:sz w:val="20"/>
-                <w:szCs w:val="20"/>
-              </w:rPr>
-              <w:t xml:space="preserve"> para obtener puntos infinitos (que al </w:t>
-            </w:r>
-            <w:r>
-              <w:rPr>
-                <w:color w:val="000000" w:themeColor="text1"/>
-                <w:sz w:val="20"/>
-                <w:szCs w:val="20"/>
-              </w:rPr>
-              <w:t>escáner</w:t>
-            </w:r>
-            <w:r>
-              <w:rPr>
-                <w:color w:val="000000" w:themeColor="text1"/>
-                <w:sz w:val="20"/>
-                <w:szCs w:val="20"/>
-              </w:rPr>
-              <w:t xml:space="preserve"> si se </w:t>
-            </w:r>
-            <w:r>
-              <w:rPr>
-                <w:color w:val="000000" w:themeColor="text1"/>
-                <w:sz w:val="20"/>
-                <w:szCs w:val="20"/>
-              </w:rPr>
-              <w:t>realice</w:t>
-            </w:r>
-            <w:r>
-              <w:rPr>
-                <w:color w:val="000000" w:themeColor="text1"/>
-                <w:sz w:val="20"/>
-                <w:szCs w:val="20"/>
-              </w:rPr>
-              <w:t xml:space="preserve"> la </w:t>
-            </w:r>
-            <w:r>
-              <w:rPr>
-                <w:color w:val="000000" w:themeColor="text1"/>
-                <w:sz w:val="20"/>
-                <w:szCs w:val="20"/>
-              </w:rPr>
-              <w:t>acción</w:t>
-            </w:r>
-            <w:r>
-              <w:rPr>
-                <w:color w:val="000000" w:themeColor="text1"/>
-                <w:sz w:val="20"/>
-                <w:szCs w:val="20"/>
-              </w:rPr>
-              <w:t xml:space="preserve"> de reciclar).</w:t>
+              <w:t>: Las competencias que se necesitan para realizar pruebas de calidad es indispensable para validar la precisión del modelo en situaciones reales (iluminación, fondos variados) y verificar la seguridad del sistema de puntos mediante reglas que eviten abuso de los usaron para obtener puntos infinitos (que al escáner si se realice la acción de reciclar).</w:t>
             </w:r>
           </w:p>
         </w:tc>
@@ -2851,6 +2358,110 @@
                 <w:color w:val="000000" w:themeColor="text1"/>
                 <w:sz w:val="20"/>
                 <w:szCs w:val="20"/>
+              </w:rPr>
+            </w:pPr>
+            <w:r>
+              <w:rPr>
+                <w:color w:val="000000" w:themeColor="text1"/>
+                <w:sz w:val="20"/>
+                <w:szCs w:val="20"/>
+              </w:rPr>
+              <w:t xml:space="preserve">Respuesta Ignacio: </w:t>
+            </w:r>
+            <w:r>
+              <w:rPr>
+                <w:color w:val="000000" w:themeColor="text1"/>
+                <w:sz w:val="20"/>
+                <w:szCs w:val="20"/>
+              </w:rPr>
+              <w:t xml:space="preserve">Mis intereses profesionales están dirigidos a la inteligencia artificial. Mi interés en la inteligencia artificial está muy reflejado en este proyecto, ya que tiene todo un punto en donde la inteligencia artificial tiene importancia, en donde esta tiene que clasificar los residuos. Esta me ayudará mucho en mi desarrollo porque voy a pasar por todas las fases del desarrollo de una IA hasta la parte de </w:t>
+            </w:r>
+            <w:proofErr w:type="spellStart"/>
+            <w:r>
+              <w:rPr>
+                <w:color w:val="000000" w:themeColor="text1"/>
+                <w:sz w:val="20"/>
+                <w:szCs w:val="20"/>
+              </w:rPr>
+              <w:t>TensorFlow</w:t>
+            </w:r>
+            <w:proofErr w:type="spellEnd"/>
+            <w:r>
+              <w:rPr>
+                <w:color w:val="000000" w:themeColor="text1"/>
+                <w:sz w:val="20"/>
+                <w:szCs w:val="20"/>
+              </w:rPr>
+              <w:t xml:space="preserve">, en donde se fusiona con la </w:t>
+            </w:r>
+            <w:r>
+              <w:rPr>
+                <w:color w:val="000000" w:themeColor="text1"/>
+                <w:sz w:val="20"/>
+                <w:szCs w:val="20"/>
+              </w:rPr>
+              <w:t>APP</w:t>
+            </w:r>
+            <w:r>
+              <w:rPr>
+                <w:color w:val="000000" w:themeColor="text1"/>
+                <w:sz w:val="20"/>
+                <w:szCs w:val="20"/>
+              </w:rPr>
+              <w:t xml:space="preserve"> y se prueba si resultó el entrenamiento.</w:t>
+            </w:r>
+          </w:p>
+          <w:p>
+            <w:pPr>
+              <w:jc w:val="both"/>
+              <w:rPr>
+                <w:color w:val="000000" w:themeColor="text1"/>
+                <w:sz w:val="20"/>
+                <w:szCs w:val="20"/>
+              </w:rPr>
+            </w:pPr>
+            <w:r>
+              <w:rPr>
+                <w:color w:val="000000" w:themeColor="text1"/>
+                <w:sz w:val="20"/>
+                <w:szCs w:val="20"/>
+              </w:rPr>
+              <w:t xml:space="preserve">Respuestas Nicolás: </w:t>
+            </w:r>
+            <w:r>
+              <w:rPr>
+                <w:color w:val="000000" w:themeColor="text1"/>
+                <w:sz w:val="20"/>
+                <w:szCs w:val="20"/>
+              </w:rPr>
+              <w:t>Mis intereses se centran en el desarrollo de software práctico, la automatización de tareas y la optimización de procesos mediante herramientas digitales para solucionar problemas de forma eficiente.</w:t>
+            </w:r>
+          </w:p>
+          <w:p>
+            <w:pPr>
+              <w:jc w:val="both"/>
+              <w:rPr>
+                <w:color w:val="000000" w:themeColor="text1"/>
+                <w:sz w:val="20"/>
+                <w:szCs w:val="20"/>
+              </w:rPr>
+            </w:pPr>
+            <w:r>
+              <w:rPr>
+                <w:color w:val="000000" w:themeColor="text1"/>
+                <w:sz w:val="20"/>
+                <w:szCs w:val="20"/>
+              </w:rPr>
+              <w:t>Se reflejan en la automatización de la identificación de residuos a través del escáner y en la gestión eficiente de datos mediante el mapa interactivo que organiza los puntos de reciclaje, su estado y su clasificación.</w:t>
+            </w:r>
+          </w:p>
+          <w:p>
+            <w:pPr>
+              <w:jc w:val="both"/>
+              <w:rPr>
+                <w:color w:val="000000" w:themeColor="text1"/>
+                <w:sz w:val="20"/>
+                <w:szCs w:val="20"/>
                 <w:highlight w:val="yellow"/>
               </w:rPr>
             </w:pPr>
@@ -2860,43 +2471,7 @@
                 <w:sz w:val="20"/>
                 <w:szCs w:val="20"/>
               </w:rPr>
-              <w:t xml:space="preserve">Mis intereses profesionales están dirigidos a la inteligencia artificial. Mi interés en la inteligencia artificial está muy reflejado en este proyecto, ya que tiene todo un punto en donde la inteligencia artificial tiene importancia, en donde esta tiene que clasificar los residuos. Esta me ayudará mucho en mi desarrollo porque voy a pasar por todas las fases del desarrollo de una IA hasta la parte de </w:t>
-            </w:r>
-            <w:proofErr w:type="spellStart"/>
-            <w:r>
-              <w:rPr>
-                <w:color w:val="000000" w:themeColor="text1"/>
-                <w:sz w:val="20"/>
-                <w:szCs w:val="20"/>
-              </w:rPr>
-              <w:t>TensorFlow</w:t>
-            </w:r>
-            <w:proofErr w:type="spellEnd"/>
-            <w:r>
-              <w:rPr>
-                <w:color w:val="000000" w:themeColor="text1"/>
-                <w:sz w:val="20"/>
-                <w:szCs w:val="20"/>
-              </w:rPr>
-              <w:t xml:space="preserve">, en donde se fusiona con la </w:t>
-            </w:r>
-            <w:proofErr w:type="gramStart"/>
-            <w:r>
-              <w:rPr>
-                <w:color w:val="000000" w:themeColor="text1"/>
-                <w:sz w:val="20"/>
-                <w:szCs w:val="20"/>
-              </w:rPr>
-              <w:t>app</w:t>
-            </w:r>
-            <w:proofErr w:type="gramEnd"/>
-            <w:r>
-              <w:rPr>
-                <w:color w:val="000000" w:themeColor="text1"/>
-                <w:sz w:val="20"/>
-                <w:szCs w:val="20"/>
-              </w:rPr>
-              <w:t xml:space="preserve"> y se prueba si resultó el entrenamiento.</w:t>
+              <w:t>Me permite adquirir experiencia real en el ciclo completo de desarrollo de aplicaciones, manejo de bases de datos y consumo de servicios de mapas, preparándome para crear soluciones funcionales y adaptarme a distintos desafíos tecnológicos.</w:t>
             </w:r>
           </w:p>
         </w:tc>
@@ -2920,6 +2495,7 @@
               <w:rPr>
                 <w:color w:val="1F3864"/>
               </w:rPr>
+              <w:lastRenderedPageBreak/>
               <w:t>Factibilidad de desarrollo del Proyecto APT</w:t>
             </w:r>
           </w:p>
@@ -3050,15 +2626,7 @@
                 <w:sz w:val="20"/>
                 <w:szCs w:val="20"/>
               </w:rPr>
-              <w:t xml:space="preserve"> semanas efectivas de trabajo), tiempo suficiente para ejecutar la construcción de la </w:t>
-            </w:r>
-            <w:r>
-              <w:rPr>
-                <w:color w:val="000000" w:themeColor="text1"/>
-                <w:sz w:val="20"/>
-                <w:szCs w:val="20"/>
-              </w:rPr>
-              <w:t>aplicación</w:t>
+              <w:t xml:space="preserve"> semanas efectivas de trabajo), tiempo suficiente para ejecutar la construcción de la aplicación</w:t>
             </w:r>
             <w:r>
               <w:rPr>
@@ -3106,7 +2674,6 @@
                 <w:sz w:val="20"/>
                 <w:szCs w:val="20"/>
               </w:rPr>
-              <w:lastRenderedPageBreak/>
               <w:t>Materiales requeridos:</w:t>
             </w:r>
           </w:p>
@@ -3288,31 +2855,7 @@
                 <w:sz w:val="20"/>
                 <w:szCs w:val="20"/>
               </w:rPr>
-              <w:t>E</w:t>
-            </w:r>
-            <w:r>
-              <w:rPr>
-                <w:color w:val="000000" w:themeColor="text1"/>
-                <w:sz w:val="20"/>
-                <w:szCs w:val="20"/>
-              </w:rPr>
-              <w:t>ntorno Python para el entrenamiento</w:t>
-            </w:r>
-            <w:r>
-              <w:rPr>
-                <w:color w:val="000000" w:themeColor="text1"/>
-                <w:sz w:val="20"/>
-                <w:szCs w:val="20"/>
-              </w:rPr>
-              <w:t xml:space="preserve"> de la IA</w:t>
-            </w:r>
-            <w:r>
-              <w:rPr>
-                <w:color w:val="000000" w:themeColor="text1"/>
-                <w:sz w:val="20"/>
-                <w:szCs w:val="20"/>
-              </w:rPr>
-              <w:t xml:space="preserve">.  </w:t>
+              <w:t xml:space="preserve">Entorno Python para el entrenamiento de la IA.  </w:t>
             </w:r>
           </w:p>
           <w:p>
@@ -3789,23 +3332,7 @@
                 <w:sz w:val="20"/>
                 <w:szCs w:val="20"/>
               </w:rPr>
-              <w:t xml:space="preserve">Variabilidad en la precisión </w:t>
-            </w:r>
-            <w:r>
-              <w:rPr>
-                <w:color w:val="000000" w:themeColor="text1"/>
-                <w:sz w:val="20"/>
-                <w:szCs w:val="20"/>
-              </w:rPr>
-              <w:t>de la modelo causada</w:t>
-            </w:r>
-            <w:r>
-              <w:rPr>
-                <w:color w:val="000000" w:themeColor="text1"/>
-                <w:sz w:val="20"/>
-                <w:szCs w:val="20"/>
-              </w:rPr>
-              <w:t xml:space="preserve"> por iluminación deficiente, fondos complejos o bolsas con residuos mezclados.</w:t>
+              <w:t>Variabilidad en la precisión de la modelo causada por iluminación deficiente, fondos complejos o bolsas con residuos mezclados.</w:t>
             </w:r>
           </w:p>
           <w:p>
@@ -3842,72 +3369,6 @@
         </w:tc>
       </w:tr>
     </w:tbl>
-    <w:p>
-      <w:pPr>
-        <w:rPr>
-          <w:b/>
-          <w:bCs/>
-          <w:color w:val="4472C4"/>
-          <w:sz w:val="32"/>
-          <w:szCs w:val="32"/>
-        </w:rPr>
-      </w:pPr>
-    </w:p>
-    <w:p>
-      <w:pPr>
-        <w:rPr>
-          <w:b/>
-          <w:bCs/>
-          <w:color w:val="4472C4"/>
-          <w:sz w:val="32"/>
-          <w:szCs w:val="32"/>
-        </w:rPr>
-      </w:pPr>
-    </w:p>
-    <w:p>
-      <w:pPr>
-        <w:rPr>
-          <w:b/>
-          <w:bCs/>
-          <w:color w:val="4472C4"/>
-          <w:sz w:val="32"/>
-          <w:szCs w:val="32"/>
-        </w:rPr>
-      </w:pPr>
-    </w:p>
-    <w:p>
-      <w:pPr>
-        <w:rPr>
-          <w:b/>
-          <w:bCs/>
-          <w:color w:val="4472C4"/>
-          <w:sz w:val="32"/>
-          <w:szCs w:val="32"/>
-        </w:rPr>
-      </w:pPr>
-    </w:p>
-    <w:p>
-      <w:pPr>
-        <w:rPr>
-          <w:b/>
-          <w:bCs/>
-          <w:color w:val="4472C4"/>
-          <w:sz w:val="32"/>
-          <w:szCs w:val="32"/>
-        </w:rPr>
-      </w:pPr>
-    </w:p>
-    <w:p>
-      <w:pPr>
-        <w:rPr>
-          <w:b/>
-          <w:bCs/>
-          <w:color w:val="4472C4"/>
-          <w:sz w:val="32"/>
-          <w:szCs w:val="32"/>
-        </w:rPr>
-      </w:pPr>
-    </w:p>
     <w:p>
       <w:pPr>
         <w:rPr>
@@ -4168,23 +3629,7 @@
                 <w:sz w:val="20"/>
                 <w:szCs w:val="20"/>
               </w:rPr>
-              <w:t xml:space="preserve"> que incorpore Inteligencia Artificial para la clasificación automática de residuos por imagen, un sistema de geolocalización de puntos limpios y un modelo de</w:t>
-            </w:r>
-            <w:r>
-              <w:rPr>
-                <w:color w:val="000000" w:themeColor="text1"/>
-                <w:sz w:val="20"/>
-                <w:szCs w:val="20"/>
-              </w:rPr>
-              <w:t xml:space="preserve"> obtención de puntos </w:t>
-            </w:r>
-            <w:r>
-              <w:rPr>
-                <w:color w:val="000000" w:themeColor="text1"/>
-                <w:sz w:val="20"/>
-                <w:szCs w:val="20"/>
-              </w:rPr>
-              <w:t>para incentivar el reciclaje domiciliario.</w:t>
+              <w:t xml:space="preserve"> que incorpore Inteligencia Artificial para la clasificación automática de residuos por imagen, un sistema de geolocalización de puntos limpios y un modelo de obtención de puntos para incentivar el reciclaje domiciliario.</w:t>
             </w:r>
           </w:p>
         </w:tc>
@@ -4295,16 +3740,7 @@
                 <w:sz w:val="20"/>
                 <w:szCs w:val="20"/>
               </w:rPr>
-              <w:t>tflite_</w:t>
-            </w:r>
-            <w:proofErr w:type="gramStart"/>
-            <w:r>
-              <w:rPr>
-                <w:color w:val="000000" w:themeColor="text1"/>
-                <w:sz w:val="20"/>
-                <w:szCs w:val="20"/>
-              </w:rPr>
-              <w:t>flutter</w:t>
+              <w:t>tflite_flutter</w:t>
             </w:r>
             <w:proofErr w:type="spellEnd"/>
             <w:r>
@@ -4313,24 +3749,7 @@
                 <w:sz w:val="20"/>
                 <w:szCs w:val="20"/>
               </w:rPr>
-              <w:t>)</w:t>
-            </w:r>
-            <w:r>
-              <w:rPr>
-                <w:color w:val="000000" w:themeColor="text1"/>
-                <w:sz w:val="20"/>
-                <w:szCs w:val="20"/>
-              </w:rPr>
-              <w:t>y</w:t>
-            </w:r>
-            <w:proofErr w:type="gramEnd"/>
-            <w:r>
-              <w:rPr>
-                <w:color w:val="000000" w:themeColor="text1"/>
-                <w:sz w:val="20"/>
-                <w:szCs w:val="20"/>
-              </w:rPr>
-              <w:t xml:space="preserve"> la visualización de mapas (Google </w:t>
+              <w:t xml:space="preserve">)y la visualización de mapas (Google </w:t>
             </w:r>
             <w:proofErr w:type="spellStart"/>
             <w:r>
@@ -4348,18 +3767,8 @@
                 <w:sz w:val="20"/>
                 <w:szCs w:val="20"/>
               </w:rPr>
-              <w:t xml:space="preserve"> SDK</w:t>
-            </w:r>
-            <w:proofErr w:type="gramStart"/>
-            <w:r>
-              <w:rPr>
-                <w:color w:val="000000" w:themeColor="text1"/>
-                <w:sz w:val="20"/>
-                <w:szCs w:val="20"/>
-              </w:rPr>
-              <w:t>) .</w:t>
-            </w:r>
-            <w:proofErr w:type="gramEnd"/>
+              <w:t xml:space="preserve"> SDK) .</w:t>
+            </w:r>
           </w:p>
           <w:p>
             <w:pPr>
@@ -4995,8 +4404,9 @@
                 <w:sz w:val="20"/>
                 <w:szCs w:val="20"/>
               </w:rPr>
-              <w:t xml:space="preserve">Diseñar </w:t>
-            </w:r>
+              <w:t xml:space="preserve">Diseñar en </w:t>
+            </w:r>
+            <w:proofErr w:type="spellStart"/>
             <w:r>
               <w:rPr>
                 <w:i/>
@@ -5005,9 +4415,9 @@
                 <w:sz w:val="20"/>
                 <w:szCs w:val="20"/>
               </w:rPr>
-              <w:t xml:space="preserve">en </w:t>
-            </w:r>
-            <w:proofErr w:type="spellStart"/>
+              <w:t>Firebase</w:t>
+            </w:r>
+            <w:proofErr w:type="spellEnd"/>
             <w:r>
               <w:rPr>
                 <w:i/>
@@ -5016,9 +4426,9 @@
                 <w:sz w:val="20"/>
                 <w:szCs w:val="20"/>
               </w:rPr>
-              <w:t>Firebase</w:t>
-            </w:r>
-            <w:proofErr w:type="spellEnd"/>
+              <w:t xml:space="preserve"> </w:t>
+            </w:r>
+            <w:proofErr w:type="spellStart"/>
             <w:r>
               <w:rPr>
                 <w:i/>
@@ -5027,9 +4437,9 @@
                 <w:sz w:val="20"/>
                 <w:szCs w:val="20"/>
               </w:rPr>
-              <w:t xml:space="preserve"> </w:t>
-            </w:r>
-            <w:proofErr w:type="spellStart"/>
+              <w:t>Firestore</w:t>
+            </w:r>
+            <w:proofErr w:type="spellEnd"/>
             <w:r>
               <w:rPr>
                 <w:i/>
@@ -5038,9 +4448,16 @@
                 <w:sz w:val="20"/>
                 <w:szCs w:val="20"/>
               </w:rPr>
-              <w:t>Firestore</w:t>
-            </w:r>
-            <w:proofErr w:type="spellEnd"/>
+              <w:t>, que incluye las colecciones para usuarios, historial de puntos,</w:t>
+            </w:r>
+            <w:r>
+              <w:rPr>
+                <w:color w:val="000000" w:themeColor="text1"/>
+                <w:sz w:val="20"/>
+                <w:szCs w:val="20"/>
+              </w:rPr>
+              <w:t xml:space="preserve"> </w:t>
+            </w:r>
             <w:r>
               <w:rPr>
                 <w:i/>
@@ -5049,45 +4466,7 @@
                 <w:sz w:val="20"/>
                 <w:szCs w:val="20"/>
               </w:rPr>
-              <w:t>, que incluye las colecciones para usuarios, historial de puntos,</w:t>
-            </w:r>
-            <w:r>
-              <w:rPr>
-                <w:color w:val="000000" w:themeColor="text1"/>
-                <w:sz w:val="20"/>
-                <w:szCs w:val="20"/>
-              </w:rPr>
-              <w:t xml:space="preserve"> </w:t>
-            </w:r>
-            <w:r>
-              <w:rPr>
-                <w:i/>
-                <w:iCs/>
-                <w:color w:val="000000" w:themeColor="text1"/>
-                <w:sz w:val="20"/>
-                <w:szCs w:val="20"/>
-              </w:rPr>
-              <w:t>empresas</w:t>
-            </w:r>
-            <w:r>
-              <w:rPr>
-                <w:i/>
-                <w:iCs/>
-                <w:color w:val="000000" w:themeColor="text1"/>
-                <w:sz w:val="20"/>
-                <w:szCs w:val="20"/>
-              </w:rPr>
-              <w:t xml:space="preserve"> </w:t>
-            </w:r>
-            <w:r>
-              <w:rPr>
-                <w:i/>
-                <w:iCs/>
-                <w:color w:val="000000" w:themeColor="text1"/>
-                <w:sz w:val="20"/>
-                <w:szCs w:val="20"/>
-              </w:rPr>
-              <w:t>y grupos comunales, junto con sus reglas de seguridad NoSQL</w:t>
+              <w:t>empresas y grupos comunales, junto con sus reglas de seguridad NoSQL</w:t>
             </w:r>
           </w:p>
         </w:tc>
@@ -5232,15 +4611,7 @@
                 <w:sz w:val="20"/>
                 <w:szCs w:val="20"/>
               </w:rPr>
-              <w:t xml:space="preserve">Modelo de red neuronal convolucional </w:t>
-            </w:r>
-            <w:r>
-              <w:rPr>
-                <w:color w:val="000000" w:themeColor="text1"/>
-                <w:sz w:val="20"/>
-                <w:szCs w:val="20"/>
-              </w:rPr>
-              <w:t>entrenado</w:t>
+              <w:t>Modelo de red neuronal convolucional entrenado</w:t>
             </w:r>
             <w:r>
               <w:t>,</w:t>
@@ -5251,15 +4622,7 @@
                 <w:sz w:val="20"/>
                 <w:szCs w:val="20"/>
               </w:rPr>
-              <w:t xml:space="preserve"> exportado a </w:t>
-            </w:r>
-            <w:r>
-              <w:rPr>
-                <w:color w:val="000000" w:themeColor="text1"/>
-                <w:sz w:val="20"/>
-                <w:szCs w:val="20"/>
-              </w:rPr>
-              <w:t>formato. tafite</w:t>
+              <w:t xml:space="preserve"> exportado a formato. tafite</w:t>
             </w:r>
             <w:r>
               <w:t xml:space="preserve"> </w:t>
@@ -6250,21 +5613,7 @@
               <w:rPr>
                 <w:color w:val="1F3864"/>
               </w:rPr>
-              <w:t xml:space="preserve">En la siguiente tabla define la planificación de tu Proyecto APT </w:t>
-            </w:r>
-            <w:proofErr w:type="gramStart"/>
-            <w:r>
-              <w:rPr>
-                <w:color w:val="1F3864"/>
-              </w:rPr>
-              <w:t>de acuerdo a</w:t>
-            </w:r>
-            <w:proofErr w:type="gramEnd"/>
-            <w:r>
-              <w:rPr>
-                <w:color w:val="1F3864"/>
-              </w:rPr>
-              <w:t xml:space="preserve"> lo requerido.</w:t>
+              <w:t>En la siguiente tabla define la planificación de tu Proyecto APT de acuerdo a lo requerido.</w:t>
             </w:r>
           </w:p>
         </w:tc>
@@ -6378,21 +5727,7 @@
               <w:rPr>
                 <w:color w:val="1F3864"/>
               </w:rPr>
-              <w:t xml:space="preserve">Nombre </w:t>
-            </w:r>
-            <w:proofErr w:type="gramStart"/>
-            <w:r>
-              <w:rPr>
-                <w:color w:val="1F3864"/>
-              </w:rPr>
-              <w:t>de  Actividades</w:t>
-            </w:r>
-            <w:proofErr w:type="gramEnd"/>
-            <w:r>
-              <w:rPr>
-                <w:color w:val="1F3864"/>
-              </w:rPr>
-              <w:t>/Tareas</w:t>
+              <w:t>Nombre de  Actividades/Tareas</w:t>
             </w:r>
           </w:p>
         </w:tc>
@@ -6573,15 +5908,7 @@
                 <w:sz w:val="20"/>
                 <w:szCs w:val="20"/>
               </w:rPr>
-              <w:t>Levantamiento de Requerimientos y Diseño de Arquitectura</w:t>
-            </w:r>
-            <w:r>
-              <w:rPr>
-                <w:color w:val="000000" w:themeColor="text1"/>
-                <w:sz w:val="20"/>
-                <w:szCs w:val="20"/>
-              </w:rPr>
-              <w:t xml:space="preserve"> (base de datos)</w:t>
+              <w:t>Levantamiento de Requerimientos y Diseño de Arquitectura (base de datos)</w:t>
             </w:r>
           </w:p>
         </w:tc>
@@ -6855,15 +6182,7 @@
                 <w:sz w:val="20"/>
                 <w:szCs w:val="20"/>
               </w:rPr>
-              <w:t xml:space="preserve">Recolección de </w:t>
-            </w:r>
-            <w:r>
-              <w:rPr>
-                <w:color w:val="000000" w:themeColor="text1"/>
-                <w:sz w:val="20"/>
-                <w:szCs w:val="20"/>
-              </w:rPr>
-              <w:t>imágenes</w:t>
+              <w:t>Recolección de imágenes</w:t>
             </w:r>
             <w:r>
               <w:t>,</w:t>
@@ -6890,16 +6209,7 @@
                 <w:sz w:val="20"/>
                 <w:szCs w:val="20"/>
               </w:rPr>
-              <w:t xml:space="preserve">, entrenamiento MobileNetV2 y exportación </w:t>
-            </w:r>
-            <w:proofErr w:type="gramStart"/>
-            <w:r>
-              <w:rPr>
-                <w:color w:val="000000" w:themeColor="text1"/>
-                <w:sz w:val="20"/>
-                <w:szCs w:val="20"/>
-              </w:rPr>
-              <w:t>a .</w:t>
+              <w:t>, entrenamiento MobileNetV2 y exportación a .</w:t>
             </w:r>
             <w:proofErr w:type="spellStart"/>
             <w:r>
@@ -6911,7 +6221,6 @@
               <w:t>tflite</w:t>
             </w:r>
             <w:proofErr w:type="spellEnd"/>
-            <w:proofErr w:type="gramEnd"/>
             <w:r>
               <w:rPr>
                 <w:color w:val="000000" w:themeColor="text1"/>
@@ -7552,42 +6861,15 @@
                 <w:sz w:val="20"/>
                 <w:szCs w:val="20"/>
               </w:rPr>
-              <w:t xml:space="preserve">Configuración </w:t>
-            </w:r>
-            <w:proofErr w:type="gramStart"/>
-            <w:r>
-              <w:rPr>
-                <w:color w:val="000000" w:themeColor="text1"/>
-                <w:sz w:val="20"/>
-                <w:szCs w:val="20"/>
-              </w:rPr>
-              <w:t>de</w:t>
-            </w:r>
-            <w:r>
-              <w:rPr>
-                <w:color w:val="000000" w:themeColor="text1"/>
-                <w:sz w:val="20"/>
-                <w:szCs w:val="20"/>
-              </w:rPr>
-              <w:t>la</w:t>
-            </w:r>
-            <w:proofErr w:type="gramEnd"/>
-            <w:r>
-              <w:rPr>
-                <w:color w:val="000000" w:themeColor="text1"/>
-                <w:sz w:val="20"/>
-                <w:szCs w:val="20"/>
-              </w:rPr>
-              <w:t xml:space="preserve"> base de </w:t>
-            </w:r>
-            <w:proofErr w:type="gramStart"/>
-            <w:r>
-              <w:rPr>
-                <w:color w:val="000000" w:themeColor="text1"/>
-                <w:sz w:val="20"/>
-                <w:szCs w:val="20"/>
-              </w:rPr>
-              <w:t xml:space="preserve">datos </w:t>
+              <w:t>Configuración de</w:t>
+            </w:r>
+            <w:r>
+              <w:rPr>
+                <w:color w:val="000000" w:themeColor="text1"/>
+                <w:sz w:val="20"/>
+                <w:szCs w:val="20"/>
+              </w:rPr>
+              <w:t xml:space="preserve">la base de datos </w:t>
             </w:r>
             <w:r>
               <w:rPr>
@@ -7607,7 +6889,6 @@
               <w:t>Firebase</w:t>
             </w:r>
             <w:proofErr w:type="spellEnd"/>
-            <w:proofErr w:type="gramEnd"/>
             <w:r>
               <w:rPr>
                 <w:color w:val="000000" w:themeColor="text1"/>
@@ -14804,6 +14085,7 @@
   <w:style w:type="character" w:default="1" w:styleId="Fuentedeprrafopredeter">
     <w:name w:val="Default Paragraph Font"/>
     <w:uiPriority w:val="1"/>
+    <w:semiHidden/>
     <w:unhideWhenUsed/>
   </w:style>
   <w:style w:type="table" w:default="1" w:styleId="Tablanormal">
@@ -15648,28 +14930,28 @@
 </file>
 
 <file path=customXml/item1.xml><?xml version="1.0" encoding="utf-8"?>
+<b:Sources xmlns:b="http://schemas.openxmlformats.org/officeDocument/2006/bibliography" xmlns="http://schemas.openxmlformats.org/officeDocument/2006/bibliography" SelectedStyle="\APASixthEditionOfficeOnline.xsl" StyleName="APA" Version="6"/>
+</file>
+
+<file path=customXml/item2.xml><?xml version="1.0" encoding="utf-8"?>
 <go:gDocsCustomXmlDataStorage xmlns:go="http://customooxmlschemas.google.com/" xmlns:r="http://schemas.openxmlformats.org/officeDocument/2006/relationships" uri="GoogleDocsCustomDataVersion2">
   <go:docsCustomData xmlns:go="http://customooxmlschemas.google.com/" roundtripDataSignature="AMtx7mgD1NSrvQHH5TCgJGJNkZmEgUVT7w==">CgMxLjA4AHIhMU1OVHZ1RGYyTUE3NmUzVzVsR0pPQklTbHVMLUlkMk0w</go:docsCustomData>
 </go:gDocsCustomXmlDataStorage>
 </file>
 
-<file path=customXml/item2.xml><?xml version="1.0" encoding="utf-8"?>
-<b:Sources xmlns:b="http://schemas.openxmlformats.org/officeDocument/2006/bibliography" xmlns="http://schemas.openxmlformats.org/officeDocument/2006/bibliography" SelectedStyle="\APASixthEditionOfficeOnline.xsl" StyleName="APA" Version="6"/>
+<file path=customXml/itemProps1.xml><?xml version="1.0" encoding="utf-8"?>
+<ds:datastoreItem xmlns:ds="http://schemas.openxmlformats.org/officeDocument/2006/customXml" ds:itemID="{88A04EA3-796E-4ED6-A2FC-F873F667DB5A}">
+  <ds:schemaRefs>
+    <ds:schemaRef ds:uri="http://schemas.openxmlformats.org/officeDocument/2006/bibliography"/>
+  </ds:schemaRefs>
+</ds:datastoreItem>
 </file>
 
-<file path=customXml/itemProps1.xml><?xml version="1.0" encoding="utf-8"?>
+<file path=customXml/itemProps2.xml><?xml version="1.0" encoding="utf-8"?>
 <ds:datastoreItem xmlns:ds="http://schemas.openxmlformats.org/officeDocument/2006/customXml" ds:itemID="{11111111-1234-1234-1234-123412341234}">
   <ds:schemaRefs>
     <ds:schemaRef ds:uri="http://customooxmlschemas.google.com/"/>
     <ds:schemaRef ds:uri="http://schemas.openxmlformats.org/officeDocument/2006/relationships"/>
   </ds:schemaRefs>
 </ds:datastoreItem>
-</file>
-
-<file path=customXml/itemProps2.xml><?xml version="1.0" encoding="utf-8"?>
-<ds:datastoreItem xmlns:ds="http://schemas.openxmlformats.org/officeDocument/2006/customXml" ds:itemID="{88A04EA3-796E-4ED6-A2FC-F873F667DB5A}">
-  <ds:schemaRefs>
-    <ds:schemaRef ds:uri="http://schemas.openxmlformats.org/officeDocument/2006/bibliography"/>
-  </ds:schemaRefs>
-</ds:datastoreItem>
 </file>
</xml_diff>